<commit_message>
Added Task 3 screenshots
</commit_message>
<xml_diff>
--- a/Screenshots/Command Line Interface (CLI).docx
+++ b/Screenshots/Command Line Interface (CLI).docx
@@ -36,7 +36,7 @@
           <w:lang w:val="en-US"/>
         </w:rPr>
         <w:drawing>
-          <wp:inline distT="0" distB="0" distL="0" distR="0" wp14:anchorId="3E3F917E" wp14:editId="39B5AC0B">
+          <wp:inline distT="0" distB="0" distL="0" distR="0" wp14:anchorId="3E3F917E" wp14:editId="3443E14F">
             <wp:extent cx="6120130" cy="3271520"/>
             <wp:effectExtent l="0" t="0" r="0" b="5080"/>
             <wp:docPr id="587697845" name="Billede 1" descr="Windows PowerShell"/>
@@ -97,7 +97,7 @@
           <w:lang w:val="en-US"/>
         </w:rPr>
         <w:drawing>
-          <wp:inline distT="0" distB="0" distL="0" distR="0" wp14:anchorId="3854905E" wp14:editId="1B930345">
+          <wp:inline distT="0" distB="0" distL="0" distR="0" wp14:anchorId="3854905E" wp14:editId="6A7F649E">
             <wp:extent cx="6120130" cy="3595370"/>
             <wp:effectExtent l="0" t="0" r="0" b="5080"/>
             <wp:docPr id="1500583936" name="Billede 3" descr="Windows PowerShell"/>
@@ -159,7 +159,7 @@
         </w:rPr>
         <w:lastRenderedPageBreak/>
         <w:drawing>
-          <wp:inline distT="0" distB="0" distL="0" distR="0" wp14:anchorId="392980CE" wp14:editId="4617D852">
+          <wp:inline distT="0" distB="0" distL="0" distR="0" wp14:anchorId="392980CE" wp14:editId="01746CD2">
             <wp:extent cx="6120130" cy="3595370"/>
             <wp:effectExtent l="0" t="0" r="0" b="5080"/>
             <wp:docPr id="869406359" name="Billede 4" descr="Windows PowerShell"/>
@@ -220,7 +220,7 @@
           <w:lang w:val="en-US"/>
         </w:rPr>
         <w:drawing>
-          <wp:inline distT="0" distB="0" distL="0" distR="0" wp14:anchorId="05B7FAFD" wp14:editId="41276905">
+          <wp:inline distT="0" distB="0" distL="0" distR="0" wp14:anchorId="05B7FAFD" wp14:editId="5AB589CD">
             <wp:extent cx="6120130" cy="3595370"/>
             <wp:effectExtent l="0" t="0" r="0" b="5080"/>
             <wp:docPr id="1913234748" name="Billede 5" descr="Windows PowerShell"/>
@@ -305,7 +305,7 @@
           <w:lang w:val="en-US"/>
         </w:rPr>
         <w:drawing>
-          <wp:inline distT="0" distB="0" distL="0" distR="0" wp14:anchorId="2A736BEF" wp14:editId="744AF4BD">
+          <wp:inline distT="0" distB="0" distL="0" distR="0" wp14:anchorId="2A736BEF" wp14:editId="5A6E7619">
             <wp:extent cx="6120130" cy="3595370"/>
             <wp:effectExtent l="0" t="0" r="0" b="5080"/>
             <wp:docPr id="991729681" name="Billede 8" descr="Windows PowerShell"/>
@@ -366,7 +366,7 @@
           <w:lang w:val="en-US"/>
         </w:rPr>
         <w:drawing>
-          <wp:anchor distT="0" distB="0" distL="114300" distR="114300" simplePos="0" relativeHeight="251658240" behindDoc="0" locked="0" layoutInCell="1" allowOverlap="1" wp14:anchorId="4A2C2707" wp14:editId="1CAEB766">
+          <wp:anchor distT="0" distB="0" distL="114300" distR="114300" simplePos="0" relativeHeight="251658240" behindDoc="0" locked="0" layoutInCell="1" allowOverlap="1" wp14:anchorId="4A2C2707" wp14:editId="7822644A">
             <wp:simplePos x="723900" y="5448300"/>
             <wp:positionH relativeFrom="column">
               <wp:align>left</wp:align>
@@ -435,7 +435,7 @@
         </w:rPr>
         <w:lastRenderedPageBreak/>
         <w:drawing>
-          <wp:inline distT="0" distB="0" distL="0" distR="0" wp14:anchorId="220C614E" wp14:editId="5A6C4093">
+          <wp:inline distT="0" distB="0" distL="0" distR="0" wp14:anchorId="220C614E" wp14:editId="240893FF">
             <wp:extent cx="6120130" cy="3595370"/>
             <wp:effectExtent l="0" t="0" r="0" b="5080"/>
             <wp:docPr id="1838049185" name="Billede 10" descr="Windows PowerShell"/>
@@ -489,7 +489,7 @@
           <w:lang w:val="en-US"/>
         </w:rPr>
         <w:drawing>
-          <wp:inline distT="0" distB="0" distL="0" distR="0" wp14:anchorId="12B87CDC" wp14:editId="6952C40C">
+          <wp:inline distT="0" distB="0" distL="0" distR="0" wp14:anchorId="12B87CDC" wp14:editId="4CB0570E">
             <wp:extent cx="6120130" cy="3595370"/>
             <wp:effectExtent l="0" t="0" r="0" b="5080"/>
             <wp:docPr id="43272674" name="Billede 11" descr="Windows PowerShell"/>
@@ -544,7 +544,7 @@
         </w:rPr>
         <w:lastRenderedPageBreak/>
         <w:drawing>
-          <wp:inline distT="0" distB="0" distL="0" distR="0" wp14:anchorId="6197B2C3" wp14:editId="174D9397">
+          <wp:inline distT="0" distB="0" distL="0" distR="0" wp14:anchorId="6197B2C3" wp14:editId="20072202">
             <wp:extent cx="6120130" cy="3595370"/>
             <wp:effectExtent l="0" t="0" r="0" b="5080"/>
             <wp:docPr id="660235780" name="Billede 12" descr="Windows PowerShell"/>
@@ -589,6 +589,273 @@
     <w:p>
       <w:pPr>
         <w:rPr>
+          <w:b/>
+          <w:bCs/>
+        </w:rPr>
+      </w:pPr>
+      <w:r>
+        <w:rPr>
+          <w:b/>
+          <w:bCs/>
+        </w:rPr>
+        <w:t>Opgave 3: Git via CLI</w:t>
+      </w:r>
+    </w:p>
+    <w:p/>
+    <w:p>
+      <w:r>
+        <w:rPr>
+          <w:noProof/>
+        </w:rPr>
+        <w:drawing>
+          <wp:inline distT="0" distB="0" distL="0" distR="0" wp14:anchorId="7731FECC" wp14:editId="5408CC3F">
+            <wp:extent cx="6120130" cy="3271520"/>
+            <wp:effectExtent l="0" t="0" r="0" b="5080"/>
+            <wp:docPr id="1472752106" name="Billede 1" descr="Windows PowerShell"/>
+            <wp:cNvGraphicFramePr>
+              <a:graphicFrameLocks xmlns:a="http://schemas.openxmlformats.org/drawingml/2006/main" noChangeAspect="1"/>
+            </wp:cNvGraphicFramePr>
+            <a:graphic xmlns:a="http://schemas.openxmlformats.org/drawingml/2006/main">
+              <a:graphicData uri="http://schemas.openxmlformats.org/drawingml/2006/picture">
+                <pic:pic xmlns:pic="http://schemas.openxmlformats.org/drawingml/2006/picture">
+                  <pic:nvPicPr>
+                    <pic:cNvPr id="1472752106" name="Billede 1472752106" descr="Windows PowerShell"/>
+                    <pic:cNvPicPr/>
+                  </pic:nvPicPr>
+                  <pic:blipFill>
+                    <a:blip r:embed="rId15" cstate="print">
+                      <a:extLst>
+                        <a:ext uri="{28A0092B-C50C-407E-A947-70E740481C1C}">
+                          <a14:useLocalDpi xmlns:a14="http://schemas.microsoft.com/office/drawing/2010/main" val="0"/>
+                        </a:ext>
+                      </a:extLst>
+                    </a:blip>
+                    <a:stretch>
+                      <a:fillRect/>
+                    </a:stretch>
+                  </pic:blipFill>
+                  <pic:spPr>
+                    <a:xfrm>
+                      <a:off x="0" y="0"/>
+                      <a:ext cx="6120130" cy="3271520"/>
+                    </a:xfrm>
+                    <a:prstGeom prst="rect">
+                      <a:avLst/>
+                    </a:prstGeom>
+                  </pic:spPr>
+                </pic:pic>
+              </a:graphicData>
+            </a:graphic>
+          </wp:inline>
+        </w:drawing>
+      </w:r>
+    </w:p>
+    <w:p>
+      <w:r>
+        <w:rPr>
+          <w:noProof/>
+        </w:rPr>
+        <w:lastRenderedPageBreak/>
+        <w:drawing>
+          <wp:inline distT="0" distB="0" distL="0" distR="0" wp14:anchorId="70907BB4" wp14:editId="71E69B07">
+            <wp:extent cx="6120130" cy="3271520"/>
+            <wp:effectExtent l="0" t="0" r="0" b="5080"/>
+            <wp:docPr id="1398621956" name="Billede 2" descr="Windows PowerShell"/>
+            <wp:cNvGraphicFramePr>
+              <a:graphicFrameLocks xmlns:a="http://schemas.openxmlformats.org/drawingml/2006/main" noChangeAspect="1"/>
+            </wp:cNvGraphicFramePr>
+            <a:graphic xmlns:a="http://schemas.openxmlformats.org/drawingml/2006/main">
+              <a:graphicData uri="http://schemas.openxmlformats.org/drawingml/2006/picture">
+                <pic:pic xmlns:pic="http://schemas.openxmlformats.org/drawingml/2006/picture">
+                  <pic:nvPicPr>
+                    <pic:cNvPr id="1398621956" name="Billede 1398621956" descr="Windows PowerShell"/>
+                    <pic:cNvPicPr/>
+                  </pic:nvPicPr>
+                  <pic:blipFill>
+                    <a:blip r:embed="rId16" cstate="print">
+                      <a:extLst>
+                        <a:ext uri="{28A0092B-C50C-407E-A947-70E740481C1C}">
+                          <a14:useLocalDpi xmlns:a14="http://schemas.microsoft.com/office/drawing/2010/main" val="0"/>
+                        </a:ext>
+                      </a:extLst>
+                    </a:blip>
+                    <a:stretch>
+                      <a:fillRect/>
+                    </a:stretch>
+                  </pic:blipFill>
+                  <pic:spPr>
+                    <a:xfrm>
+                      <a:off x="0" y="0"/>
+                      <a:ext cx="6120130" cy="3271520"/>
+                    </a:xfrm>
+                    <a:prstGeom prst="rect">
+                      <a:avLst/>
+                    </a:prstGeom>
+                  </pic:spPr>
+                </pic:pic>
+              </a:graphicData>
+            </a:graphic>
+          </wp:inline>
+        </w:drawing>
+      </w:r>
+    </w:p>
+    <w:p>
+      <w:r>
+        <w:rPr>
+          <w:noProof/>
+        </w:rPr>
+        <w:drawing>
+          <wp:inline distT="0" distB="0" distL="0" distR="0" wp14:anchorId="36D65873" wp14:editId="580C05D3">
+            <wp:extent cx="6120130" cy="3271520"/>
+            <wp:effectExtent l="0" t="0" r="0" b="5080"/>
+            <wp:docPr id="1369799087" name="Billede 3" descr="Windows PowerShell"/>
+            <wp:cNvGraphicFramePr>
+              <a:graphicFrameLocks xmlns:a="http://schemas.openxmlformats.org/drawingml/2006/main" noChangeAspect="1"/>
+            </wp:cNvGraphicFramePr>
+            <a:graphic xmlns:a="http://schemas.openxmlformats.org/drawingml/2006/main">
+              <a:graphicData uri="http://schemas.openxmlformats.org/drawingml/2006/picture">
+                <pic:pic xmlns:pic="http://schemas.openxmlformats.org/drawingml/2006/picture">
+                  <pic:nvPicPr>
+                    <pic:cNvPr id="1369799087" name="Billede 1369799087" descr="Windows PowerShell"/>
+                    <pic:cNvPicPr/>
+                  </pic:nvPicPr>
+                  <pic:blipFill>
+                    <a:blip r:embed="rId17" cstate="print">
+                      <a:extLst>
+                        <a:ext uri="{28A0092B-C50C-407E-A947-70E740481C1C}">
+                          <a14:useLocalDpi xmlns:a14="http://schemas.microsoft.com/office/drawing/2010/main" val="0"/>
+                        </a:ext>
+                      </a:extLst>
+                    </a:blip>
+                    <a:stretch>
+                      <a:fillRect/>
+                    </a:stretch>
+                  </pic:blipFill>
+                  <pic:spPr>
+                    <a:xfrm>
+                      <a:off x="0" y="0"/>
+                      <a:ext cx="6120130" cy="3271520"/>
+                    </a:xfrm>
+                    <a:prstGeom prst="rect">
+                      <a:avLst/>
+                    </a:prstGeom>
+                  </pic:spPr>
+                </pic:pic>
+              </a:graphicData>
+            </a:graphic>
+          </wp:inline>
+        </w:drawing>
+      </w:r>
+    </w:p>
+    <w:p>
+      <w:r>
+        <w:rPr>
+          <w:noProof/>
+        </w:rPr>
+        <w:lastRenderedPageBreak/>
+        <w:drawing>
+          <wp:inline distT="0" distB="0" distL="0" distR="0" wp14:anchorId="60484585" wp14:editId="4F9FDF4D">
+            <wp:extent cx="6120130" cy="3271520"/>
+            <wp:effectExtent l="0" t="0" r="0" b="5080"/>
+            <wp:docPr id="1828002758" name="Billede 4" descr="Windows PowerShell"/>
+            <wp:cNvGraphicFramePr>
+              <a:graphicFrameLocks xmlns:a="http://schemas.openxmlformats.org/drawingml/2006/main" noChangeAspect="1"/>
+            </wp:cNvGraphicFramePr>
+            <a:graphic xmlns:a="http://schemas.openxmlformats.org/drawingml/2006/main">
+              <a:graphicData uri="http://schemas.openxmlformats.org/drawingml/2006/picture">
+                <pic:pic xmlns:pic="http://schemas.openxmlformats.org/drawingml/2006/picture">
+                  <pic:nvPicPr>
+                    <pic:cNvPr id="1828002758" name="Billede 1828002758" descr="Windows PowerShell"/>
+                    <pic:cNvPicPr/>
+                  </pic:nvPicPr>
+                  <pic:blipFill>
+                    <a:blip r:embed="rId18" cstate="print">
+                      <a:extLst>
+                        <a:ext uri="{28A0092B-C50C-407E-A947-70E740481C1C}">
+                          <a14:useLocalDpi xmlns:a14="http://schemas.microsoft.com/office/drawing/2010/main" val="0"/>
+                        </a:ext>
+                      </a:extLst>
+                    </a:blip>
+                    <a:stretch>
+                      <a:fillRect/>
+                    </a:stretch>
+                  </pic:blipFill>
+                  <pic:spPr>
+                    <a:xfrm>
+                      <a:off x="0" y="0"/>
+                      <a:ext cx="6120130" cy="3271520"/>
+                    </a:xfrm>
+                    <a:prstGeom prst="rect">
+                      <a:avLst/>
+                    </a:prstGeom>
+                  </pic:spPr>
+                </pic:pic>
+              </a:graphicData>
+            </a:graphic>
+          </wp:inline>
+        </w:drawing>
+      </w:r>
+    </w:p>
+    <w:p>
+      <w:r>
+        <w:rPr>
+          <w:noProof/>
+        </w:rPr>
+        <w:drawing>
+          <wp:inline distT="0" distB="0" distL="0" distR="0" wp14:anchorId="43465A99" wp14:editId="7D0E8050">
+            <wp:extent cx="6120130" cy="3271520"/>
+            <wp:effectExtent l="0" t="0" r="0" b="5080"/>
+            <wp:docPr id="1962040744" name="Billede 5" descr="Windows PowerShell"/>
+            <wp:cNvGraphicFramePr>
+              <a:graphicFrameLocks xmlns:a="http://schemas.openxmlformats.org/drawingml/2006/main" noChangeAspect="1"/>
+            </wp:cNvGraphicFramePr>
+            <a:graphic xmlns:a="http://schemas.openxmlformats.org/drawingml/2006/main">
+              <a:graphicData uri="http://schemas.openxmlformats.org/drawingml/2006/picture">
+                <pic:pic xmlns:pic="http://schemas.openxmlformats.org/drawingml/2006/picture">
+                  <pic:nvPicPr>
+                    <pic:cNvPr id="1962040744" name="Billede 1962040744" descr="Windows PowerShell"/>
+                    <pic:cNvPicPr/>
+                  </pic:nvPicPr>
+                  <pic:blipFill>
+                    <a:blip r:embed="rId19" cstate="print">
+                      <a:extLst>
+                        <a:ext uri="{28A0092B-C50C-407E-A947-70E740481C1C}">
+                          <a14:useLocalDpi xmlns:a14="http://schemas.microsoft.com/office/drawing/2010/main" val="0"/>
+                        </a:ext>
+                      </a:extLst>
+                    </a:blip>
+                    <a:stretch>
+                      <a:fillRect/>
+                    </a:stretch>
+                  </pic:blipFill>
+                  <pic:spPr>
+                    <a:xfrm>
+                      <a:off x="0" y="0"/>
+                      <a:ext cx="6120130" cy="3271520"/>
+                    </a:xfrm>
+                    <a:prstGeom prst="rect">
+                      <a:avLst/>
+                    </a:prstGeom>
+                  </pic:spPr>
+                </pic:pic>
+              </a:graphicData>
+            </a:graphic>
+          </wp:inline>
+        </w:drawing>
+      </w:r>
+    </w:p>
+    <w:p/>
+    <w:p/>
+    <w:p>
+      <w:pPr>
+        <w:rPr>
+          <w:lang w:val="en-US"/>
+        </w:rPr>
+      </w:pPr>
+    </w:p>
+    <w:p>
+      <w:pPr>
+        <w:rPr>
           <w:lang w:val="en-US"/>
         </w:rPr>
       </w:pPr>
@@ -636,7 +903,7 @@
       </w:pPr>
     </w:p>
     <w:sectPr>
-      <w:footerReference w:type="default" r:id="rId15"/>
+      <w:footerReference w:type="default" r:id="rId20"/>
       <w:pgSz w:w="11906" w:h="16838"/>
       <w:pgMar w:top="1701" w:right="1134" w:bottom="1701" w:left="1134" w:header="708" w:footer="708" w:gutter="0"/>
       <w:cols w:space="708"/>
@@ -1340,6 +1607,7 @@
   <w:style w:type="character" w:default="1" w:styleId="Standardskrifttypeiafsnit">
     <w:name w:val="Default Paragraph Font"/>
     <w:uiPriority w:val="1"/>
+    <w:semiHidden/>
     <w:unhideWhenUsed/>
   </w:style>
   <w:style w:type="table" w:default="1" w:styleId="Tabel-Normal">

</xml_diff>